<commit_message>
Model run for Germany
</commit_message>
<xml_diff>
--- a/output/Table_1_Ireland.docx
+++ b/output/Table_1_Ireland.docx
@@ -11792,7 +11792,7 @@
                 <w:szCs w:val="22"/>
                 <w:color w:val="000000"/>
               </w:rPr>
-              <w:t xml:space="preserve">0.08</w:t>
+              <w:t xml:space="preserve">0.06</w:t>
             </w:r>
           </w:p>
         </w:tc>
@@ -12122,7 +12122,7 @@
                 <w:szCs w:val="22"/>
                 <w:color w:val="000000"/>
               </w:rPr>
-              <w:t xml:space="preserve">0.08</w:t>
+              <w:t xml:space="preserve">0.06</w:t>
             </w:r>
           </w:p>
         </w:tc>

</xml_diff>

<commit_message>
Full application of the model finally outputting country by country, I changed line 5460 from:
default_country_for_downstream <- "Ireland"

To:

default_country_for_downstream <- country_name

To:

Use whatever country_name was already set by your sourced params file (Ireland, Germany, or Spain)
Make the if/else block (lines 5464-5500) select the correct country's parameters
Ensure the PSA uses the correct WTP threshold and all other country-specific parameters
Save the CSV with the correct country name in the filename
</commit_message>
<xml_diff>
--- a/output/Table_1_Ireland.docx
+++ b/output/Table_1_Ireland.docx
@@ -11792,7 +11792,7 @@
                 <w:szCs w:val="22"/>
                 <w:color w:val="000000"/>
               </w:rPr>
-              <w:t xml:space="preserve">0.06</w:t>
+              <w:t xml:space="preserve">0.08</w:t>
             </w:r>
           </w:p>
         </w:tc>
@@ -12122,7 +12122,7 @@
                 <w:szCs w:val="22"/>
                 <w:color w:val="000000"/>
               </w:rPr>
-              <w:t xml:space="preserve">0.06</w:t>
+              <w:t xml:space="preserve">0.08</w:t>
             </w:r>
           </w:p>
         </w:tc>

</xml_diff>